<commit_message>
publish student projects (Fall 2026) 2026-09-22 19:03
</commit_message>
<xml_diff>
--- a/Games/orbital-waddle.docx
+++ b/Games/orbital-waddle.docx
@@ -2446,13 +2446,55 @@
         <w:rPr>
           <w:b/>
         </w:rPr>
-        <w:t xml:space="preserve">Recommended composition:</w:t>
-      </w:r>
-      <w:r>
-        <w:t xml:space="preserve"> </w:t>
-      </w:r>
-      <w:r>
-        <w:t xml:space="preserve">6 CS + 1 Design + 2 Art (9) — four distinct planet themes, a 5-enemy roster + the Astrorca boss, the penguin, the growing arsenal and its VFX, and the cosmetic skins are a large art surface, so two artists carry it; a single designer owns the roguelite economy (weapons/upgrades/stats), the wave/planet/progression design and the New Game+ tiers (rules: min 1 Design mandated, max 9 total, D+A ≤ 3; see</w:t>
+        <w:t xml:space="preserve">Team composition (set by instructor):</w:t>
+      </w:r>
+      <w:r>
+        <w:t xml:space="preserve"> </w:t>
+      </w:r>
+      <w:r>
+        <w:t xml:space="preserve">6 CS + 1 Design + 0 Art (7) — a large art surface (four distinct planet themes, a 5-enemy roster + the Astrorca boss, the penguin, the growing arsenal and its VFX, and the cosmetic skins) now has</w:t>
+      </w:r>
+      <w:r>
+        <w:t xml:space="preserve"> </w:t>
+      </w:r>
+      <w:r>
+        <w:rPr>
+          <w:b/>
+        </w:rPr>
+        <w:t xml:space="preserve">no artist</w:t>
+      </w:r>
+      <w:r>
+        <w:t xml:space="preserve">, so the single designer owns the roguelite economy and the wave/planet/progression design</w:t>
+      </w:r>
+      <w:r>
+        <w:t xml:space="preserve"> </w:t>
+      </w:r>
+      <w:r>
+        <w:rPr>
+          <w:i/>
+        </w:rPr>
+        <w:t xml:space="preserve">and</w:t>
+      </w:r>
+      <w:r>
+        <w:t xml:space="preserve"> </w:t>
+      </w:r>
+      <w:r>
+        <w:t xml:space="preserve">takes the</w:t>
+      </w:r>
+      <w:r>
+        <w:t xml:space="preserve"> </w:t>
+      </w:r>
+      <w:r>
+        <w:rPr>
+          <w:b/>
+        </w:rPr>
+        <w:t xml:space="preserve">D11 conditional</w:t>
+      </w:r>
+      <w:r>
+        <w:t xml:space="preserve"> </w:t>
+      </w:r>
+      <w:r>
+        <w:t xml:space="preserve">as a real graded Design goal each milestone (M1 Art Proof of Concept / M2 Art Implementation Quality — the last Design goal each milestone), which consumes one Design+UI slot per milestone (rules: min 1 Design mandated, max 9 total, D+A ≤ 3; see</w:t>
       </w:r>
       <w:r>
         <w:t xml:space="preserve"> </w:t>
@@ -2464,7 +2506,22 @@
         <w:t xml:space="preserve">team-formation.pdf</w:t>
       </w:r>
       <w:r>
-        <w:t xml:space="preserve">). If the economy + wave/tier design outgrows one designer, trade the 2nd artist for a 2nd designer.</w:t>
+        <w:t xml:space="preserve">).</w:t>
+      </w:r>
+      <w:r>
+        <w:t xml:space="preserve"> </w:t>
+      </w:r>
+      <w:r>
+        <w:rPr>
+          <w:b/>
+        </w:rPr>
+        <w:t xml:space="preserve">Art-risk flag:</w:t>
+      </w:r>
+      <w:r>
+        <w:t xml:space="preserve"> </w:t>
+      </w:r>
+      <w:r>
+        <w:t xml:space="preserve">this is a very art-forward game (planets, enemies, boss, arsenal, cosmetics), so 0 artists is a serious risk — scope the roster/planets hard and lean on a reusable stylised direction under D11, or reconsider adding an artist within the D+A ≤ 3 cap (a solo designer + 0 artists is exactly the case the design pool flags, and squeezes the designer's systems/balance goals).</w:t>
       </w:r>
       <w:r>
         <w:t xml:space="preserve"> </w:t>
@@ -2562,7 +2619,7 @@
         <w:pStyle w:val="Compact"/>
       </w:pPr>
       <w:r>
-        <w:t xml:space="preserve">M1D6 Systems &amp; Economy Design (the weapon/ability/upgrade/stat economy, the wave/key pacing and the cosmetic-only NG+ rewards — every system with a purpose)</w:t>
+        <w:t xml:space="preserve">M1D11 Art Proof of Concept *(conditional — no artist; Design-owned)* — the visual direction: the astronaut penguin, the four planet themes, the 5-enemy roster + the Astrorca boss and the arsenal/VFX look; 2 mockups. *(Replaces the M1D6 economy-design slot the artist's absence consumes.)*</w:t>
       </w:r>
     </w:p>
     <w:p>
@@ -2601,7 +2658,7 @@
         <w:pStyle w:val="Compact"/>
       </w:pPr>
       <w:r>
-        <w:t xml:space="preserve">M2D3 Systems Balance &amp; Tuning — Data-Driven (combat, arsenal, wave and difficulty-tier balance via the config tool, no code changes)</w:t>
+        <w:t xml:space="preserve">M2D11 Art Implementation Quality *(conditional — no artist; Design-owned)* — the penguin, the four planets, the enemy roster + boss, the arsenal + VFX and the cosmetic skins implemented in-engine, no placeholders.</w:t>
       </w:r>
     </w:p>
     <w:p>
@@ -2688,85 +2745,13 @@
         <w:rPr>
           <w:b/>
         </w:rPr>
-        <w:t xml:space="preserve">Art M1:</w:t>
-      </w:r>
-      <w:r>
-        <w:t xml:space="preserve"> </w:t>
-      </w:r>
-      <w:r>
-        <w:t xml:space="preserve">2 artists justified (4 planet themes + 5 enemies + boss + arsenal VFX)</w:t>
-      </w:r>
-    </w:p>
-    <w:p>
-      <w:pPr>
-        <w:numPr>
-          <w:ilvl w:val="1"/>
-          <w:numId w:val="1022"/>
-        </w:numPr>
-        <w:pStyle w:val="Compact"/>
-      </w:pPr>
-      <w:r>
-        <w:t xml:space="preserve">M1A1 ⭐ Art Bible / Proof of Concept (the isometric cube-world direction — palette per planet, readability at 100-enemy density)</w:t>
-      </w:r>
-    </w:p>
-    <w:p>
-      <w:pPr>
-        <w:numPr>
-          <w:ilvl w:val="1"/>
-          <w:numId w:val="1022"/>
-        </w:numPr>
-        <w:pStyle w:val="Compact"/>
-      </w:pPr>
-      <w:r>
-        <w:t xml:space="preserve">M1A2 Character Concepts &amp; Model Sheets (the penguin, the 5 enemies and the Astrorca boss)</w:t>
-      </w:r>
-    </w:p>
-    <w:p>
-      <w:pPr>
-        <w:numPr>
-          <w:ilvl w:val="1"/>
-          <w:numId w:val="1022"/>
-        </w:numPr>
-        <w:pStyle w:val="Compact"/>
-      </w:pPr>
-      <w:r>
-        <w:t xml:space="preserve">M1A3 Environment, Props &amp; VFX Concepts (the 4 planet themes/terrain + the arsenal/ability effect language)</w:t>
-      </w:r>
-    </w:p>
-    <w:p>
-      <w:pPr>
-        <w:numPr>
-          <w:ilvl w:val="1"/>
-          <w:numId w:val="1022"/>
-        </w:numPr>
-        <w:pStyle w:val="Compact"/>
-      </w:pPr>
-      <w:r>
-        <w:t xml:space="preserve">M1A4 UI Art Concepts &amp; Typography (HUD, Thingamajig compass, arsenal/upgrade screens)</w:t>
-      </w:r>
-    </w:p>
-    <w:p>
-      <w:pPr>
-        <w:numPr>
-          <w:ilvl w:val="1"/>
-          <w:numId w:val="1022"/>
-        </w:numPr>
-        <w:pStyle w:val="Compact"/>
-      </w:pPr>
-      <w:r>
-        <w:t xml:space="preserve">M1A5 Animation Foundations (penguin, enemy and attack cycles; the rotation transition)</w:t>
-      </w:r>
-    </w:p>
-    <w:p>
-      <w:pPr>
-        <w:numPr>
-          <w:ilvl w:val="1"/>
-          <w:numId w:val="1022"/>
-        </w:numPr>
-        <w:pStyle w:val="Compact"/>
-      </w:pPr>
-      <w:r>
-        <w:t xml:space="preserve">M1A6 Early Asset Production — Prototype Support</w:t>
+        <w:t xml:space="preserve">Art:</w:t>
+      </w:r>
+      <w:r>
+        <w:t xml:space="preserve"> </w:t>
+      </w:r>
+      <w:r>
+        <w:t xml:space="preserve">0 artists — the large art surface (the penguin, the 4 planet themes, the 5-enemy roster + Astrorca boss, the arsenal/VFX and the cosmetic skins) is covered by the D11 conditionals, taken as Design goals by the single designer (see Design M1/M2). This game is very art-forward, so 0 artists is a serious risk — scope the roster/planets hard and lean on a reusable stylised direction.</w:t>
       </w:r>
     </w:p>
     <w:p>
@@ -2781,79 +2766,31 @@
         <w:rPr>
           <w:b/>
         </w:rPr>
-        <w:t xml:space="preserve">Art M2:</w:t>
-      </w:r>
-    </w:p>
-    <w:p>
-      <w:pPr>
-        <w:numPr>
-          <w:ilvl w:val="1"/>
-          <w:numId w:val="1023"/>
-        </w:numPr>
-        <w:pStyle w:val="Compact"/>
-      </w:pPr>
-      <w:r>
-        <w:t xml:space="preserve">M2A1 ⭐ Critical Asset Production &amp; In-Engine Visual Quality</w:t>
-      </w:r>
-    </w:p>
-    <w:p>
-      <w:pPr>
-        <w:numPr>
-          <w:ilvl w:val="1"/>
-          <w:numId w:val="1023"/>
-        </w:numPr>
-        <w:pStyle w:val="Compact"/>
-      </w:pPr>
-      <w:r>
-        <w:t xml:space="preserve">M2A2 Character Animation — Extensive (the roster, the boss, ability reactions)</w:t>
-      </w:r>
-    </w:p>
-    <w:p>
-      <w:pPr>
-        <w:numPr>
-          <w:ilvl w:val="1"/>
-          <w:numId w:val="1023"/>
-        </w:numPr>
-        <w:pStyle w:val="Compact"/>
-      </w:pPr>
-      <w:r>
-        <w:t xml:space="preserve">M2A3 Environment Alive — Ambient Animation &amp; Layering (the 4 living planet worlds + the rotation)</w:t>
-      </w:r>
-    </w:p>
-    <w:p>
-      <w:pPr>
-        <w:numPr>
-          <w:ilvl w:val="1"/>
-          <w:numId w:val="1023"/>
-        </w:numPr>
-        <w:pStyle w:val="Compact"/>
-      </w:pPr>
-      <w:r>
-        <w:t xml:space="preserve">M2A4 UI Art — States &amp; Feedback (upgrade-choice, wave-clear, compass states)</w:t>
-      </w:r>
-    </w:p>
-    <w:p>
-      <w:pPr>
-        <w:numPr>
-          <w:ilvl w:val="1"/>
-          <w:numId w:val="1023"/>
-        </w:numPr>
-        <w:pStyle w:val="Compact"/>
-      </w:pPr>
-      <w:r>
-        <w:t xml:space="preserve">M2A5 VFX — Critical Effects &amp; Transitions (weapons, abilities, the world-rotation transition — the signature moment)</w:t>
-      </w:r>
-    </w:p>
-    <w:p>
-      <w:pPr>
-        <w:numPr>
-          <w:ilvl w:val="1"/>
-          <w:numId w:val="1023"/>
-        </w:numPr>
-        <w:pStyle w:val="Compact"/>
-      </w:pPr>
-      <w:r>
-        <w:t xml:space="preserve">M2A6 Cutscenes &amp; Storyboards (the kidnapping intro / Planet 67 confrontation / rescue)</w:t>
+        <w:t xml:space="preserve">TEAM M1:</w:t>
+      </w:r>
+    </w:p>
+    <w:p>
+      <w:pPr>
+        <w:numPr>
+          <w:ilvl w:val="1"/>
+          <w:numId w:val="1022"/>
+        </w:numPr>
+        <w:pStyle w:val="Compact"/>
+      </w:pPr>
+      <w:r>
+        <w:t xml:space="preserve">M1TA1 ⭐ Overall Audio Experience — initial BGM/SFX from the week-5 needs list present &amp; working in the prototype (per-planet BGM, weapon/hit/ability, enemy and the rotation "whoosh" cues), suitable and correctly triggered.</w:t>
+      </w:r>
+    </w:p>
+    <w:p>
+      <w:pPr>
+        <w:numPr>
+          <w:ilvl w:val="1"/>
+          <w:numId w:val="1022"/>
+        </w:numPr>
+        <w:pStyle w:val="Compact"/>
+      </w:pPr>
+      <w:r>
+        <w:t xml:space="preserve">M1TA2 ⭐ Audio Engine Functionality — data-driven audio pipeline (add/replace files without recompiling) + reliable multi-channel playback for a 100-enemy combat mix.</w:t>
       </w:r>
     </w:p>
     <w:p>
@@ -2868,45 +2805,6 @@
         <w:rPr>
           <w:b/>
         </w:rPr>
-        <w:t xml:space="preserve">TEAM M1:</w:t>
-      </w:r>
-    </w:p>
-    <w:p>
-      <w:pPr>
-        <w:numPr>
-          <w:ilvl w:val="1"/>
-          <w:numId w:val="1024"/>
-        </w:numPr>
-        <w:pStyle w:val="Compact"/>
-      </w:pPr>
-      <w:r>
-        <w:t xml:space="preserve">M1TA1 ⭐ Overall Audio Experience — initial BGM/SFX from the week-5 needs list present &amp; working in the prototype (per-planet BGM, weapon/hit/ability, enemy and the rotation "whoosh" cues), suitable and correctly triggered.</w:t>
-      </w:r>
-    </w:p>
-    <w:p>
-      <w:pPr>
-        <w:numPr>
-          <w:ilvl w:val="1"/>
-          <w:numId w:val="1024"/>
-        </w:numPr>
-        <w:pStyle w:val="Compact"/>
-      </w:pPr>
-      <w:r>
-        <w:t xml:space="preserve">M1TA2 ⭐ Audio Engine Functionality — data-driven audio pipeline (add/replace files without recompiling) + reliable multi-channel playback for a 100-enemy combat mix.</w:t>
-      </w:r>
-    </w:p>
-    <w:p>
-      <w:pPr>
-        <w:numPr>
-          <w:ilvl w:val="0"/>
-          <w:numId w:val="1017"/>
-        </w:numPr>
-        <w:pStyle w:val="Compact"/>
-      </w:pPr>
-      <w:r>
-        <w:rPr>
-          <w:b/>
-        </w:rPr>
         <w:t xml:space="preserve">TEAM M2:</w:t>
       </w:r>
     </w:p>
@@ -2914,7 +2812,7 @@
       <w:pPr>
         <w:numPr>
           <w:ilvl w:val="1"/>
-          <w:numId w:val="1025"/>
+          <w:numId w:val="1023"/>
         </w:numPr>
         <w:pStyle w:val="Compact"/>
       </w:pPr>
@@ -2926,7 +2824,7 @@
       <w:pPr>
         <w:numPr>
           <w:ilvl w:val="1"/>
-          <w:numId w:val="1025"/>
+          <w:numId w:val="1023"/>
         </w:numPr>
         <w:pStyle w:val="Compact"/>
       </w:pPr>
@@ -2938,7 +2836,7 @@
       <w:pPr>
         <w:numPr>
           <w:ilvl w:val="1"/>
-          <w:numId w:val="1025"/>
+          <w:numId w:val="1023"/>
         </w:numPr>
         <w:pStyle w:val="Compact"/>
       </w:pPr>
@@ -3283,12 +3181,6 @@
     <w:abstractNumId w:val="991"/>
   </w:num>
   <w:num w:numId="1023">
-    <w:abstractNumId w:val="991"/>
-  </w:num>
-  <w:num w:numId="1024">
-    <w:abstractNumId w:val="991"/>
-  </w:num>
-  <w:num w:numId="1025">
     <w:abstractNumId w:val="991"/>
   </w:num>
 </w:numbering>

</xml_diff>